<commit_message>
update final report word document
</commit_message>
<xml_diff>
--- a/Contiguous_Memory_Allocation_Simulator_Final_Report.docx
+++ b/Contiguous_Memory_Allocation_Simulator_Final_Report.docx
@@ -144,7 +144,6 @@
         <w:t xml:space="preserve">                                                   </w:t>
       </w:r>
       <w:proofErr w:type="spellStart"/>
-      <w:proofErr w:type="gramStart"/>
       <w:r>
         <w:rPr>
           <w:sz w:val="24"/>
@@ -152,7 +151,6 @@
         <w:t>Faculty:Prof.Wasiha</w:t>
       </w:r>
       <w:proofErr w:type="spellEnd"/>
-      <w:proofErr w:type="gramEnd"/>
       <w:r>
         <w:rPr>
           <w:sz w:val="24"/>
@@ -527,9 +525,9 @@
         </w:rPr>
         <w:lastRenderedPageBreak/>
         <w:drawing>
-          <wp:inline distT="0" distB="0" distL="0" distR="0" wp14:anchorId="051AD0EF" wp14:editId="70CE0A7B">
-            <wp:extent cx="5943600" cy="11533593"/>
-            <wp:effectExtent l="0" t="0" r="0" b="0"/>
+          <wp:inline distT="0" distB="0" distL="0" distR="0" wp14:anchorId="051AD0EF" wp14:editId="02DF7A09">
+            <wp:extent cx="4592515" cy="8911804"/>
+            <wp:effectExtent l="0" t="0" r="0" b="3810"/>
             <wp:docPr id="1" name="Picture 1"/>
             <wp:cNvGraphicFramePr>
               <a:graphicFrameLocks xmlns:a="http://schemas.openxmlformats.org/drawingml/2006/main" noChangeAspect="1"/>
@@ -550,7 +548,7 @@
                   <pic:spPr>
                     <a:xfrm>
                       <a:off x="0" y="0"/>
-                      <a:ext cx="5943600" cy="11533593"/>
+                      <a:ext cx="4599332" cy="8925033"/>
                     </a:xfrm>
                     <a:prstGeom prst="rect">
                       <a:avLst/>

</xml_diff>